<commit_message>
Neutralize handover docs; replace step-by-step guide with a global guide
Remove all personal / tutoring framing from the deliverable French documents so they
read as standalone professional documents.

- NEW reports/guide_global_FR.md (+ Guide_global_FR.docx): a neutral project overview
  and reading map (objective, definitions, how to read the numbers, the work step by
  step, the three replacement approaches, conclusion, document map, remaining write-up,
  FAQ). Replaces reports/guide_pas_a_pas.md (removed), which was framed as a
  beginner/tutoring aid.
- these_principale_FR.md: "Restent a ecrire par l'etudiante" -> "Restent a rediger".
- tracabilite_code_FR.md: reference updated to the global guide.
- build_docx.py builds Guide_global_FR.docx.

No analytical results changed.

Co-Authored-By: Claude Opus 4.8 <noreply@anthropic.com>
Claude-Session: https://claude.ai/code/session_01BpRuhc2aBcap5ePk6Ra9LE
</commit_message>
<xml_diff>
--- a/reports/docx/These_principale_FR.docx
+++ b/reports/docx/These_principale_FR.docx
@@ -7076,7 +7076,7 @@
         <w:t xml:space="preserve"> </w:t>
       </w:r>
       <w:r>
-        <w:t xml:space="preserve">Restent à écrire par l'étudiante : la</w:t>
+        <w:t xml:space="preserve">Restent à rédiger : la</w:t>
       </w:r>
       <w:r>
         <w:t xml:space="preserve"> </w:t>
@@ -7115,7 +7115,13 @@
         <w:t xml:space="preserve">références</w:t>
       </w:r>
       <w:r>
-        <w:t xml:space="preserve">, l'introduction, la discussion et la conclusion rédigées.</w:t>
+        <w:t xml:space="preserve">,</w:t>
+      </w:r>
+      <w:r>
+        <w:t xml:space="preserve"> </w:t>
+      </w:r>
+      <w:r>
+        <w:t xml:space="preserve">l'introduction, la discussion et la conclusion.</w:t>
       </w:r>
     </w:p>
     <w:p>

</xml_diff>